<commit_message>
Add author name to both lab reports
</commit_message>
<xml_diff>
--- a/lab-1/Отчёт_ЛР1_Оценка_деятельности_организаций.docx
+++ b/lab-1/Отчёт_ЛР1_Оценка_деятельности_организаций.docx
@@ -31,34 +31,21 @@
     </w:p>
     <w:p>
       <w:pPr>
-        <w:jc w:val="both"/>
-        <w:rPr>
-          <w:lang w:val="ru-RU"/>
-        </w:rPr>
+        <w:pStyle w:val="a1"/>
+        <w:keepNext/>
+        <w:spacing w:before="0" w:after="120" w:line="240" w:lineRule="auto"/>
+        <w:ind w:firstLine="0"/>
+        <w:jc w:val="right"/>
       </w:pPr>
       <w:r>
         <w:rPr>
-          <w:rFonts w:eastAsia="Times New Roman"/>
-          <w:color w:val="000000"/>
-          <w:lang w:val="ru-RU"/>
-        </w:rPr>
-        <w:t xml:space="preserve">Тема </w:t>
-      </w:r>
-      <w:r>
-        <w:rPr>
-          <w:rFonts w:eastAsia="Times New Roman"/>
-          <w:color w:val="000000"/>
-          <w:lang w:val="ru-RU"/>
-        </w:rPr>
-        <w:t>ВКР</w:t>
-      </w:r>
-      <w:r>
-        <w:rPr>
-          <w:rFonts w:eastAsia="Times New Roman"/>
-          <w:color w:val="000000"/>
-          <w:lang w:val="ru-RU"/>
-        </w:rPr>
-        <w:t xml:space="preserve"> работы: «Разработка модели оценки соответствия заявленного вида деятельности организации открытым сведениям о ней».</w:t>
+          <w:rFonts w:ascii="Times New Roman" w:hAnsi="Times New Roman" w:cs="Times New Roman"/>
+          <w:color w:val="000000"/>
+          <w:sz w:val="28"/>
+          <w:szCs w:val="28"/>
+          <w:lang w:val="ru-RU"/>
+        </w:rPr>
+        <w:t>Кириченко Даниил</w:t>
       </w:r>
     </w:p>
     <w:p>
@@ -168,7 +155,6 @@
         </w:rPr>
         <w:t>ü</w:t>
       </w:r>
-      <w:proofErr w:type="spellStart"/>
       <w:r>
         <w:rPr>
           <w:rFonts w:eastAsia="Times New Roman"/>
@@ -176,7 +162,6 @@
         </w:rPr>
         <w:t>hnemann</w:t>
       </w:r>
-      <w:proofErr w:type="spellEnd"/>
       <w:r>
         <w:rPr>
           <w:rFonts w:eastAsia="Times New Roman"/>
@@ -215,7 +200,6 @@
         </w:rPr>
         <w:t xml:space="preserve"> и </w:t>
       </w:r>
-      <w:proofErr w:type="spellStart"/>
       <w:r>
         <w:rPr>
           <w:rFonts w:eastAsia="Times New Roman"/>
@@ -223,7 +207,6 @@
         </w:rPr>
         <w:t>Windmeijer</w:t>
       </w:r>
-      <w:proofErr w:type="spellEnd"/>
       <w:r>
         <w:rPr>
           <w:rFonts w:eastAsia="Times New Roman"/>
@@ -322,25 +305,7 @@
           <w:color w:val="000000"/>
           <w:lang w:val="ru-RU"/>
         </w:rPr>
-        <w:t xml:space="preserve"> с помощью </w:t>
-      </w:r>
-      <w:proofErr w:type="spellStart"/>
-      <w:r>
-        <w:rPr>
-          <w:rFonts w:eastAsia="Times New Roman"/>
-          <w:color w:val="000000"/>
-          <w:lang w:val="ru-RU"/>
-        </w:rPr>
-        <w:t>дообученной</w:t>
-      </w:r>
-      <w:proofErr w:type="spellEnd"/>
-      <w:r>
-        <w:rPr>
-          <w:rFonts w:eastAsia="Times New Roman"/>
-          <w:color w:val="000000"/>
-          <w:lang w:val="ru-RU"/>
-        </w:rPr>
-        <w:t xml:space="preserve"> </w:t>
+        <w:t xml:space="preserve"> с помощью дообученной </w:t>
       </w:r>
       <w:r>
         <w:rPr>
@@ -410,16 +375,7 @@
           <w:color w:val="000000"/>
           <w:lang w:val="ru-RU"/>
         </w:rPr>
-        <w:t xml:space="preserve"> и соавторы [3] предлагают сначала извлекать релевантные документы, затем использовать их при генерации ответа. Этот подход позволяет искать подтверждения на сайтах и в отчётах и связывать решение с </w:t>
-      </w:r>
-      <w:r>
-        <w:rPr>
-          <w:rFonts w:eastAsia="Times New Roman"/>
-          <w:color w:val="000000"/>
-          <w:lang w:val="ru-RU"/>
-        </w:rPr>
-        <w:lastRenderedPageBreak/>
-        <w:t>источниками. В текущем эксперименте автоматического поиска нет: модель получает готовый фрагмент сайта.</w:t>
+        <w:t xml:space="preserve"> и соавторы [3] предлагают сначала извлекать релевантные документы, затем использовать их при генерации ответа. Этот подход позволяет искать подтверждения на сайтах и в отчётах и связывать решение с источниками. В текущем эксперименте автоматического поиска нет: модель получает готовый фрагмент сайта.</w:t>
       </w:r>
     </w:p>
     <w:p>
@@ -436,6 +392,7 @@
           <w:color w:val="000000"/>
           <w:lang w:val="ru-RU"/>
         </w:rPr>
+        <w:lastRenderedPageBreak/>
         <w:t>Гипотеза</w:t>
       </w:r>
     </w:p>
@@ -604,52 +561,14 @@
           <w:lang w:val="ru-RU"/>
         </w:rPr>
       </w:pPr>
-      <w:proofErr w:type="spellStart"/>
       <w:r>
         <w:rPr>
           <w:rFonts w:eastAsia="Times New Roman"/>
           <w:color w:val="000000"/>
           <w:sz w:val="24"/>
         </w:rPr>
-        <w:t>Таблица</w:t>
-      </w:r>
-      <w:proofErr w:type="spellEnd"/>
-      <w:r>
-        <w:rPr>
-          <w:rFonts w:eastAsia="Times New Roman"/>
-          <w:color w:val="000000"/>
-          <w:sz w:val="24"/>
-        </w:rPr>
-        <w:t xml:space="preserve"> 1 </w:t>
-      </w:r>
-      <w:proofErr w:type="spellStart"/>
-      <w:r>
-        <w:rPr>
-          <w:rFonts w:eastAsia="Times New Roman"/>
-          <w:color w:val="000000"/>
-          <w:sz w:val="24"/>
-        </w:rPr>
-        <w:t>Разделение</w:t>
-      </w:r>
-      <w:proofErr w:type="spellEnd"/>
-      <w:r>
-        <w:rPr>
-          <w:rFonts w:eastAsia="Times New Roman"/>
-          <w:color w:val="000000"/>
-          <w:sz w:val="24"/>
-        </w:rPr>
-        <w:t xml:space="preserve"> </w:t>
-      </w:r>
-      <w:proofErr w:type="spellStart"/>
-      <w:r>
-        <w:rPr>
-          <w:rFonts w:eastAsia="Times New Roman"/>
-          <w:color w:val="000000"/>
-          <w:sz w:val="24"/>
-        </w:rPr>
-        <w:t>данных</w:t>
-      </w:r>
-      <w:proofErr w:type="spellEnd"/>
+        <w:t>Таблица 1 Разделение данных</w:t>
+      </w:r>
     </w:p>
     <w:tbl>
       <w:tblPr>
@@ -897,34 +816,14 @@
               <w:spacing w:line="240" w:lineRule="auto"/>
               <w:ind w:firstLine="0"/>
             </w:pPr>
-            <w:proofErr w:type="spellStart"/>
             <w:r>
               <w:rPr>
                 <w:rFonts w:eastAsia="Times New Roman"/>
                 <w:color w:val="000000"/>
                 <w:sz w:val="24"/>
               </w:rPr>
-              <w:t>Выбор</w:t>
+              <w:t>Выбор модели</w:t>
             </w:r>
-            <w:proofErr w:type="spellEnd"/>
-            <w:r>
-              <w:rPr>
-                <w:rFonts w:eastAsia="Times New Roman"/>
-                <w:color w:val="000000"/>
-                <w:sz w:val="24"/>
-              </w:rPr>
-              <w:t xml:space="preserve"> </w:t>
-            </w:r>
-            <w:proofErr w:type="spellStart"/>
-            <w:r>
-              <w:rPr>
-                <w:rFonts w:eastAsia="Times New Roman"/>
-                <w:color w:val="000000"/>
-                <w:sz w:val="24"/>
-              </w:rPr>
-              <w:t>модели</w:t>
-            </w:r>
-            <w:proofErr w:type="spellEnd"/>
           </w:p>
         </w:tc>
         <w:tc>
@@ -1009,34 +908,14 @@
               <w:spacing w:line="240" w:lineRule="auto"/>
               <w:ind w:firstLine="0"/>
             </w:pPr>
-            <w:proofErr w:type="spellStart"/>
             <w:r>
               <w:rPr>
                 <w:rFonts w:eastAsia="Times New Roman"/>
                 <w:color w:val="000000"/>
                 <w:sz w:val="24"/>
               </w:rPr>
-              <w:t>Итоговый</w:t>
+              <w:t>Итоговый тест</w:t>
             </w:r>
-            <w:proofErr w:type="spellEnd"/>
-            <w:r>
-              <w:rPr>
-                <w:rFonts w:eastAsia="Times New Roman"/>
-                <w:color w:val="000000"/>
-                <w:sz w:val="24"/>
-              </w:rPr>
-              <w:t xml:space="preserve"> </w:t>
-            </w:r>
-            <w:proofErr w:type="spellStart"/>
-            <w:r>
-              <w:rPr>
-                <w:rFonts w:eastAsia="Times New Roman"/>
-                <w:color w:val="000000"/>
-                <w:sz w:val="24"/>
-              </w:rPr>
-              <w:t>тест</w:t>
-            </w:r>
-            <w:proofErr w:type="spellEnd"/>
           </w:p>
         </w:tc>
         <w:tc>
@@ -1123,7 +1002,6 @@
                 <w:color w:val="000000"/>
                 <w:sz w:val="24"/>
               </w:rPr>
-              <w:lastRenderedPageBreak/>
               <w:t>Отдельная проверка</w:t>
             </w:r>
           </w:p>
@@ -1206,6 +1084,7 @@
           <w:color w:val="000000"/>
           <w:lang w:val="ru-RU"/>
         </w:rPr>
+        <w:lastRenderedPageBreak/>
         <w:t>Для каждой компании создано одно согласованное заявление с исходной отраслью и одно противоречащее заявление с другой отраслью. Для части компаний добавлен пример без текста сайта. Всего получилось 230 пар: 100 согласованных, 100 противоречащих и 30 с отсутствующими сведениями. Это искусственно сформированные заявления, а исходная отрасль принимается за эталон. Такая разметка позволяет провести воспроизводимый опыт, но может содержать ошибки и не заменяет экспертную проверку.</w:t>
       </w:r>
     </w:p>
@@ -1284,25 +1163,7 @@
           <w:color w:val="000000"/>
           <w:lang w:val="ru-RU"/>
         </w:rPr>
-        <w:t xml:space="preserve">. Веса не </w:t>
-      </w:r>
-      <w:proofErr w:type="spellStart"/>
-      <w:r>
-        <w:rPr>
-          <w:rFonts w:eastAsia="Times New Roman"/>
-          <w:color w:val="000000"/>
-          <w:lang w:val="ru-RU"/>
-        </w:rPr>
-        <w:t>дообучались</w:t>
-      </w:r>
-      <w:proofErr w:type="spellEnd"/>
-      <w:r>
-        <w:rPr>
-          <w:rFonts w:eastAsia="Times New Roman"/>
-          <w:color w:val="000000"/>
-          <w:lang w:val="ru-RU"/>
-        </w:rPr>
-        <w:t xml:space="preserve">. Меньшие модели использовали </w:t>
+        <w:t xml:space="preserve">. Веса не дообучались. Меньшие модели использовали </w:t>
       </w:r>
       <w:r>
         <w:rPr>
@@ -1404,52 +1265,14 @@
           <w:lang w:val="ru-RU"/>
         </w:rPr>
       </w:pPr>
-      <w:proofErr w:type="spellStart"/>
       <w:r>
         <w:rPr>
           <w:rFonts w:eastAsia="Times New Roman"/>
           <w:color w:val="000000"/>
           <w:sz w:val="24"/>
         </w:rPr>
-        <w:t>Таблица</w:t>
-      </w:r>
-      <w:proofErr w:type="spellEnd"/>
-      <w:r>
-        <w:rPr>
-          <w:rFonts w:eastAsia="Times New Roman"/>
-          <w:color w:val="000000"/>
-          <w:sz w:val="24"/>
-        </w:rPr>
-        <w:t xml:space="preserve"> 2 </w:t>
-      </w:r>
-      <w:proofErr w:type="spellStart"/>
-      <w:r>
-        <w:rPr>
-          <w:rFonts w:eastAsia="Times New Roman"/>
-          <w:color w:val="000000"/>
-          <w:sz w:val="24"/>
-        </w:rPr>
-        <w:t>Сравниваемые</w:t>
-      </w:r>
-      <w:proofErr w:type="spellEnd"/>
-      <w:r>
-        <w:rPr>
-          <w:rFonts w:eastAsia="Times New Roman"/>
-          <w:color w:val="000000"/>
-          <w:sz w:val="24"/>
-        </w:rPr>
-        <w:t xml:space="preserve"> </w:t>
-      </w:r>
-      <w:proofErr w:type="spellStart"/>
-      <w:r>
-        <w:rPr>
-          <w:rFonts w:eastAsia="Times New Roman"/>
-          <w:color w:val="000000"/>
-          <w:sz w:val="24"/>
-        </w:rPr>
-        <w:t>конфигурации</w:t>
-      </w:r>
-      <w:proofErr w:type="spellEnd"/>
+        <w:t>Таблица 2 Сравниваемые конфигурации</w:t>
+      </w:r>
     </w:p>
     <w:tbl>
       <w:tblPr>
@@ -2176,7 +1999,7 @@
           <w:color w:val="000000"/>
           <w:lang w:val="ru-RU"/>
         </w:rPr>
-        <w:t xml:space="preserve">. Лишний текст, ошибка структуры или недопустимая категория </w:t>
+        <w:t xml:space="preserve">. Лишний текст, ошибка структуры или недопустимая категория считаются некорректным ответом и ошибкой оценки. Ответы автоматически не исправляются. Перед измерениями выполняется разогрев модели. Время </w:t>
       </w:r>
       <w:r>
         <w:rPr>
@@ -2185,7 +2008,7 @@
           <w:lang w:val="ru-RU"/>
         </w:rPr>
         <w:lastRenderedPageBreak/>
-        <w:t>считаются некорректным ответом и ошибкой оценки. Ответы автоматически не исправляются. Перед измерениями выполняется разогрев модели. Время загрузки весов учитывается отдельно от генерации; при замере генерации ожидается завершение операций на видеокартах.</w:t>
+        <w:t>загрузки весов учитывается отдельно от генерации; при замере генерации ожидается завершение операций на видеокартах.</w:t>
       </w:r>
     </w:p>
     <w:p>
@@ -3508,128 +3331,136 @@
           <w:color w:val="000000"/>
           <w:lang w:val="ru-RU"/>
         </w:rPr>
+        <w:t xml:space="preserve">На итоговом тесте </w:t>
+      </w:r>
+      <w:r>
+        <w:rPr>
+          <w:rFonts w:eastAsia="Times New Roman"/>
+          <w:color w:val="000000"/>
+        </w:rPr>
+        <w:t>Qwen</w:t>
+      </w:r>
+      <w:r>
+        <w:rPr>
+          <w:rFonts w:eastAsia="Times New Roman"/>
+          <w:color w:val="000000"/>
+          <w:lang w:val="ru-RU"/>
+        </w:rPr>
+        <w:t>3 8</w:t>
+      </w:r>
+      <w:r>
+        <w:rPr>
+          <w:rFonts w:eastAsia="Times New Roman"/>
+          <w:color w:val="000000"/>
+        </w:rPr>
+        <w:t>B</w:t>
+      </w:r>
+      <w:r>
+        <w:rPr>
+          <w:rFonts w:eastAsia="Times New Roman"/>
+          <w:color w:val="000000"/>
+          <w:lang w:val="ru-RU"/>
+        </w:rPr>
+        <w:t xml:space="preserve"> имеет </w:t>
+      </w:r>
+      <w:r>
+        <w:rPr>
+          <w:rFonts w:eastAsia="Times New Roman"/>
+          <w:color w:val="000000"/>
+        </w:rPr>
+        <w:t>Macro</w:t>
+      </w:r>
+      <w:r>
+        <w:rPr>
+          <w:rFonts w:eastAsia="Times New Roman"/>
+          <w:color w:val="000000"/>
+          <w:lang w:val="ru-RU"/>
+        </w:rPr>
+        <w:t>-</w:t>
+      </w:r>
+      <w:r>
+        <w:rPr>
+          <w:rFonts w:eastAsia="Times New Roman"/>
+          <w:color w:val="000000"/>
+        </w:rPr>
+        <w:t>F</w:t>
+      </w:r>
+      <w:r>
+        <w:rPr>
+          <w:rFonts w:eastAsia="Times New Roman"/>
+          <w:color w:val="000000"/>
+          <w:lang w:val="ru-RU"/>
+        </w:rPr>
+        <w:t>1 0,911 и 90,0</w:t>
+      </w:r>
+      <w:r>
+        <w:rPr>
+          <w:rFonts w:eastAsia="Times New Roman"/>
+          <w:color w:val="000000"/>
+        </w:rPr>
+        <w:t> </w:t>
+      </w:r>
+      <w:r>
+        <w:rPr>
+          <w:rFonts w:eastAsia="Times New Roman"/>
+          <w:color w:val="000000"/>
+          <w:lang w:val="ru-RU"/>
+        </w:rPr>
+        <w:t xml:space="preserve">% правильных ответов. Для </w:t>
+      </w:r>
+      <w:r>
+        <w:rPr>
+          <w:rFonts w:eastAsia="Times New Roman"/>
+          <w:color w:val="000000"/>
+        </w:rPr>
+        <w:t>baseline</w:t>
+      </w:r>
+      <w:r>
+        <w:rPr>
+          <w:rFonts w:eastAsia="Times New Roman"/>
+          <w:color w:val="000000"/>
+          <w:lang w:val="ru-RU"/>
+        </w:rPr>
+        <w:t xml:space="preserve"> </w:t>
+      </w:r>
+      <w:r>
+        <w:rPr>
+          <w:rFonts w:eastAsia="Times New Roman"/>
+          <w:color w:val="000000"/>
+        </w:rPr>
+        <w:t>Macro</w:t>
+      </w:r>
+      <w:r>
+        <w:rPr>
+          <w:rFonts w:eastAsia="Times New Roman"/>
+          <w:color w:val="000000"/>
+          <w:lang w:val="ru-RU"/>
+        </w:rPr>
+        <w:t>-</w:t>
+      </w:r>
+      <w:r>
+        <w:rPr>
+          <w:rFonts w:eastAsia="Times New Roman"/>
+          <w:color w:val="000000"/>
+        </w:rPr>
+        <w:t>F</w:t>
+      </w:r>
+      <w:r>
+        <w:rPr>
+          <w:rFonts w:eastAsia="Times New Roman"/>
+          <w:color w:val="000000"/>
+          <w:lang w:val="ru-RU"/>
+        </w:rPr>
+        <w:t xml:space="preserve">1 составляет 0,877. Увеличение размера до 32 миллиардов параметров не улучшило результат на этой выборке. Вывод </w:t>
+      </w:r>
+      <w:r>
+        <w:rPr>
+          <w:rFonts w:eastAsia="Times New Roman"/>
+          <w:color w:val="000000"/>
+          <w:lang w:val="ru-RU"/>
+        </w:rPr>
         <w:lastRenderedPageBreak/>
-        <w:t xml:space="preserve">На итоговом тесте </w:t>
-      </w:r>
-      <w:r>
-        <w:rPr>
-          <w:rFonts w:eastAsia="Times New Roman"/>
-          <w:color w:val="000000"/>
-        </w:rPr>
-        <w:t>Qwen</w:t>
-      </w:r>
-      <w:r>
-        <w:rPr>
-          <w:rFonts w:eastAsia="Times New Roman"/>
-          <w:color w:val="000000"/>
-          <w:lang w:val="ru-RU"/>
-        </w:rPr>
-        <w:t>3 8</w:t>
-      </w:r>
-      <w:r>
-        <w:rPr>
-          <w:rFonts w:eastAsia="Times New Roman"/>
-          <w:color w:val="000000"/>
-        </w:rPr>
-        <w:t>B</w:t>
-      </w:r>
-      <w:r>
-        <w:rPr>
-          <w:rFonts w:eastAsia="Times New Roman"/>
-          <w:color w:val="000000"/>
-          <w:lang w:val="ru-RU"/>
-        </w:rPr>
-        <w:t xml:space="preserve"> имеет </w:t>
-      </w:r>
-      <w:r>
-        <w:rPr>
-          <w:rFonts w:eastAsia="Times New Roman"/>
-          <w:color w:val="000000"/>
-        </w:rPr>
-        <w:t>Macro</w:t>
-      </w:r>
-      <w:r>
-        <w:rPr>
-          <w:rFonts w:eastAsia="Times New Roman"/>
-          <w:color w:val="000000"/>
-          <w:lang w:val="ru-RU"/>
-        </w:rPr>
-        <w:t>-</w:t>
-      </w:r>
-      <w:r>
-        <w:rPr>
-          <w:rFonts w:eastAsia="Times New Roman"/>
-          <w:color w:val="000000"/>
-        </w:rPr>
-        <w:t>F</w:t>
-      </w:r>
-      <w:r>
-        <w:rPr>
-          <w:rFonts w:eastAsia="Times New Roman"/>
-          <w:color w:val="000000"/>
-          <w:lang w:val="ru-RU"/>
-        </w:rPr>
-        <w:t>1 0,911 и 90,0</w:t>
-      </w:r>
-      <w:r>
-        <w:rPr>
-          <w:rFonts w:eastAsia="Times New Roman"/>
-          <w:color w:val="000000"/>
-        </w:rPr>
-        <w:t> </w:t>
-      </w:r>
-      <w:r>
-        <w:rPr>
-          <w:rFonts w:eastAsia="Times New Roman"/>
-          <w:color w:val="000000"/>
-          <w:lang w:val="ru-RU"/>
-        </w:rPr>
-        <w:t xml:space="preserve">% правильных ответов. Для </w:t>
-      </w:r>
-      <w:r>
-        <w:rPr>
-          <w:rFonts w:eastAsia="Times New Roman"/>
-          <w:color w:val="000000"/>
-        </w:rPr>
-        <w:t>baseline</w:t>
-      </w:r>
-      <w:r>
-        <w:rPr>
-          <w:rFonts w:eastAsia="Times New Roman"/>
-          <w:color w:val="000000"/>
-          <w:lang w:val="ru-RU"/>
-        </w:rPr>
-        <w:t xml:space="preserve"> </w:t>
-      </w:r>
-      <w:r>
-        <w:rPr>
-          <w:rFonts w:eastAsia="Times New Roman"/>
-          <w:color w:val="000000"/>
-        </w:rPr>
-        <w:t>Macro</w:t>
-      </w:r>
-      <w:r>
-        <w:rPr>
-          <w:rFonts w:eastAsia="Times New Roman"/>
-          <w:color w:val="000000"/>
-          <w:lang w:val="ru-RU"/>
-        </w:rPr>
-        <w:t>-</w:t>
-      </w:r>
-      <w:r>
-        <w:rPr>
-          <w:rFonts w:eastAsia="Times New Roman"/>
-          <w:color w:val="000000"/>
-        </w:rPr>
-        <w:t>F</w:t>
-      </w:r>
-      <w:r>
-        <w:rPr>
-          <w:rFonts w:eastAsia="Times New Roman"/>
-          <w:color w:val="000000"/>
-          <w:lang w:val="ru-RU"/>
-        </w:rPr>
-        <w:t>1 составляет 0,877. Увеличение размера до 32 миллиардов параметров не улучшило результат на этой выборке. Вывод относится к заданным режимам, коротким текстам и 70 тестовым парам; статистическая значимость различий не проверялась.</w:t>
+        <w:t>относится к заданным режимам, коротким текстам и 70 тестовым парам; статистическая значимость различий не проверялась.</w:t>
       </w:r>
     </w:p>
     <w:p>
@@ -3719,52 +3550,15 @@
           <w:lang w:val="ru-RU"/>
         </w:rPr>
       </w:pPr>
-      <w:proofErr w:type="spellStart"/>
       <w:r>
         <w:rPr>
           <w:rFonts w:eastAsia="Times New Roman"/>
           <w:color w:val="000000"/>
           <w:sz w:val="24"/>
-        </w:rPr>
-        <w:t>Таблица</w:t>
-      </w:r>
-      <w:proofErr w:type="spellEnd"/>
-      <w:r>
-        <w:rPr>
-          <w:rFonts w:eastAsia="Times New Roman"/>
-          <w:color w:val="000000"/>
-          <w:sz w:val="24"/>
-        </w:rPr>
-        <w:t xml:space="preserve"> 4 </w:t>
-      </w:r>
-      <w:proofErr w:type="spellStart"/>
-      <w:r>
-        <w:rPr>
-          <w:rFonts w:eastAsia="Times New Roman"/>
-          <w:color w:val="000000"/>
-          <w:sz w:val="24"/>
-        </w:rPr>
-        <w:t>Время</w:t>
-      </w:r>
-      <w:proofErr w:type="spellEnd"/>
-      <w:r>
-        <w:rPr>
-          <w:rFonts w:eastAsia="Times New Roman"/>
-          <w:color w:val="000000"/>
-          <w:sz w:val="24"/>
-        </w:rPr>
-        <w:t xml:space="preserve"> и </w:t>
-      </w:r>
-      <w:proofErr w:type="spellStart"/>
-      <w:r>
-        <w:rPr>
-          <w:rFonts w:eastAsia="Times New Roman"/>
-          <w:color w:val="000000"/>
-          <w:sz w:val="24"/>
-        </w:rPr>
-        <w:t>память</w:t>
-      </w:r>
-      <w:proofErr w:type="spellEnd"/>
+          <w:lang w:val="ru-RU"/>
+        </w:rPr>
+        <w:t>Таблица 4 Время и память</w:t>
+      </w:r>
     </w:p>
     <w:tbl>
       <w:tblPr>
@@ -4493,7 +4287,6 @@
         </w:rPr>
         <w:t xml:space="preserve">% запросов. Память отражает сумму пиковых объёмов, выделенных </w:t>
       </w:r>
-      <w:proofErr w:type="spellStart"/>
       <w:r>
         <w:rPr>
           <w:rFonts w:eastAsia="Times New Roman"/>
@@ -4501,7 +4294,6 @@
         </w:rPr>
         <w:t>PyTorch</w:t>
       </w:r>
-      <w:proofErr w:type="spellEnd"/>
       <w:r>
         <w:rPr>
           <w:rFonts w:eastAsia="Times New Roman"/>
@@ -4640,16 +4432,7 @@
           <w:color w:val="000000"/>
           <w:lang w:val="ru-RU"/>
         </w:rPr>
-        <w:t xml:space="preserve">1. При равенстве учитывается </w:t>
-      </w:r>
-      <w:r>
-        <w:rPr>
-          <w:rFonts w:eastAsia="Times New Roman"/>
-          <w:color w:val="000000"/>
-          <w:lang w:val="ru-RU"/>
-        </w:rPr>
-        <w:lastRenderedPageBreak/>
-        <w:t xml:space="preserve">меньшая медианная задержка. Итоговый тест и отдельная проверка не участвуют в выборе; </w:t>
+        <w:t xml:space="preserve">1. При равенстве учитывается меньшая медианная задержка. Итоговый тест и отдельная проверка не участвуют в выборе; </w:t>
       </w:r>
       <w:r>
         <w:rPr>
@@ -4699,6 +4482,7 @@
           <w:sz w:val="24"/>
           <w:lang w:val="ru-RU"/>
         </w:rPr>
+        <w:lastRenderedPageBreak/>
         <w:t>Таблица 5 Основание выбора на 25 парах</w:t>
       </w:r>
     </w:p>
@@ -5512,25 +5296,7 @@
           <w:color w:val="000000"/>
           <w:lang w:val="ru-RU"/>
         </w:rPr>
-        <w:t xml:space="preserve">, демонстраций или выбора модели. Это отдельная </w:t>
-      </w:r>
-      <w:proofErr w:type="spellStart"/>
-      <w:r>
-        <w:rPr>
-          <w:rFonts w:eastAsia="Times New Roman"/>
-          <w:color w:val="000000"/>
-          <w:lang w:val="ru-RU"/>
-        </w:rPr>
-        <w:t>подвыборка</w:t>
-      </w:r>
-      <w:proofErr w:type="spellEnd"/>
-      <w:r>
-        <w:rPr>
-          <w:rFonts w:eastAsia="Times New Roman"/>
-          <w:color w:val="000000"/>
-          <w:lang w:val="ru-RU"/>
-        </w:rPr>
-        <w:t xml:space="preserve"> того же исходного набора; внешние источники и более поздние сайты здесь не проверялись.</w:t>
+        <w:t>, демонстраций или выбора модели. Это отдельная подвыборка того же исходного набора; внешние источники и более поздние сайты здесь не проверялись.</w:t>
       </w:r>
     </w:p>
     <w:p>
@@ -6475,16 +6241,7 @@
           <w:color w:val="000000"/>
           <w:lang w:val="ru-RU"/>
         </w:rPr>
-        <w:t xml:space="preserve">1 составил 0,9109; на итоговом тесте было 0,9112. Близость результатов показывает, что </w:t>
-      </w:r>
-      <w:r>
-        <w:rPr>
-          <w:rFonts w:eastAsia="Times New Roman"/>
-          <w:color w:val="000000"/>
-          <w:lang w:val="ru-RU"/>
-        </w:rPr>
-        <w:lastRenderedPageBreak/>
-        <w:t>качество сохранилось при смене компаний внутри этого набора. Размер выборки пока не позволяет надёжно оценить качество для всех организаций.</w:t>
+        <w:t>1 составил 0,9109; на итоговом тесте было 0,9112. Близость результатов показывает, что качество сохранилось при смене компаний внутри этого набора. Размер выборки пока не позволяет надёжно оценить качество для всех организаций.</w:t>
       </w:r>
     </w:p>
     <w:p>
@@ -6499,6 +6256,7 @@
           <w:rFonts w:eastAsia="Times New Roman"/>
           <w:color w:val="000000"/>
         </w:rPr>
+        <w:lastRenderedPageBreak/>
         <w:t>baseline</w:t>
       </w:r>
       <w:r>
@@ -6606,18 +6364,8 @@
           <w:color w:val="000000"/>
           <w:lang w:val="ru-RU"/>
         </w:rPr>
-        <w:t xml:space="preserve">проверка на большей </w:t>
-      </w:r>
-      <w:proofErr w:type="spellStart"/>
-      <w:r>
-        <w:rPr>
-          <w:rFonts w:eastAsia="Times New Roman"/>
-          <w:color w:val="000000"/>
-          <w:lang w:val="ru-RU"/>
-        </w:rPr>
-        <w:t>подвыборке</w:t>
-      </w:r>
-      <w:proofErr w:type="spellEnd"/>
+        <w:t>проверка на большей подвыборке</w:t>
+      </w:r>
       <w:r>
         <w:rPr>
           <w:rFonts w:eastAsia="Times New Roman"/>
@@ -6659,7 +6407,6 @@
         </w:rPr>
         <w:t xml:space="preserve">Ошибки связаны с неинформативными страницами и качеством разметки. Например, </w:t>
       </w:r>
-      <w:proofErr w:type="spellStart"/>
       <w:r>
         <w:rPr>
           <w:rFonts w:eastAsia="Times New Roman"/>
@@ -6667,7 +6414,6 @@
         </w:rPr>
         <w:t>abilityresources</w:t>
       </w:r>
-      <w:proofErr w:type="spellEnd"/>
       <w:r>
         <w:rPr>
           <w:rFonts w:eastAsia="Times New Roman"/>
@@ -6864,7 +6610,97 @@
           <w:color w:val="000000"/>
           <w:lang w:val="ru-RU"/>
         </w:rPr>
-        <w:t xml:space="preserve"> на </w:t>
+        <w:t xml:space="preserve"> на отдельной группе компаний получила 91,1</w:t>
+      </w:r>
+      <w:r>
+        <w:rPr>
+          <w:rFonts w:eastAsia="Times New Roman"/>
+          <w:color w:val="000000"/>
+        </w:rPr>
+        <w:t> </w:t>
+      </w:r>
+      <w:r>
+        <w:rPr>
+          <w:rFonts w:eastAsia="Times New Roman"/>
+          <w:color w:val="000000"/>
+          <w:lang w:val="ru-RU"/>
+        </w:rPr>
+        <w:t xml:space="preserve">% правильных ответов при </w:t>
+      </w:r>
+      <w:r>
+        <w:rPr>
+          <w:rFonts w:eastAsia="Times New Roman"/>
+          <w:color w:val="000000"/>
+        </w:rPr>
+        <w:t>Macro</w:t>
+      </w:r>
+      <w:r>
+        <w:rPr>
+          <w:rFonts w:eastAsia="Times New Roman"/>
+          <w:color w:val="000000"/>
+          <w:lang w:val="ru-RU"/>
+        </w:rPr>
+        <w:t>-</w:t>
+      </w:r>
+      <w:r>
+        <w:rPr>
+          <w:rFonts w:eastAsia="Times New Roman"/>
+          <w:color w:val="000000"/>
+        </w:rPr>
+        <w:t>F</w:t>
+      </w:r>
+      <w:r>
+        <w:rPr>
+          <w:rFonts w:eastAsia="Times New Roman"/>
+          <w:color w:val="000000"/>
+          <w:lang w:val="ru-RU"/>
+        </w:rPr>
+        <w:t xml:space="preserve">1 0,9109. На итоговом тесте она превысила </w:t>
+      </w:r>
+      <w:r>
+        <w:rPr>
+          <w:rFonts w:eastAsia="Times New Roman"/>
+          <w:color w:val="000000"/>
+        </w:rPr>
+        <w:t>baseline</w:t>
+      </w:r>
+      <w:r>
+        <w:rPr>
+          <w:rFonts w:eastAsia="Times New Roman"/>
+          <w:color w:val="000000"/>
+          <w:lang w:val="ru-RU"/>
+        </w:rPr>
+        <w:t xml:space="preserve"> по </w:t>
+      </w:r>
+      <w:r>
+        <w:rPr>
+          <w:rFonts w:eastAsia="Times New Roman"/>
+          <w:color w:val="000000"/>
+        </w:rPr>
+        <w:t>Macro</w:t>
+      </w:r>
+      <w:r>
+        <w:rPr>
+          <w:rFonts w:eastAsia="Times New Roman"/>
+          <w:color w:val="000000"/>
+          <w:lang w:val="ru-RU"/>
+        </w:rPr>
+        <w:t>-</w:t>
+      </w:r>
+      <w:r>
+        <w:rPr>
+          <w:rFonts w:eastAsia="Times New Roman"/>
+          <w:color w:val="000000"/>
+        </w:rPr>
+        <w:t>F</w:t>
+      </w:r>
+      <w:r>
+        <w:rPr>
+          <w:rFonts w:eastAsia="Times New Roman"/>
+          <w:color w:val="000000"/>
+          <w:lang w:val="ru-RU"/>
+        </w:rPr>
+        <w:t xml:space="preserve">1, а на </w:t>
       </w:r>
       <w:r>
         <w:rPr>
@@ -6873,97 +6709,7 @@
           <w:lang w:val="ru-RU"/>
         </w:rPr>
         <w:lastRenderedPageBreak/>
-        <w:t>отдельной группе компаний получила 91,1</w:t>
-      </w:r>
-      <w:r>
-        <w:rPr>
-          <w:rFonts w:eastAsia="Times New Roman"/>
-          <w:color w:val="000000"/>
-        </w:rPr>
-        <w:t> </w:t>
-      </w:r>
-      <w:r>
-        <w:rPr>
-          <w:rFonts w:eastAsia="Times New Roman"/>
-          <w:color w:val="000000"/>
-          <w:lang w:val="ru-RU"/>
-        </w:rPr>
-        <w:t xml:space="preserve">% правильных ответов при </w:t>
-      </w:r>
-      <w:r>
-        <w:rPr>
-          <w:rFonts w:eastAsia="Times New Roman"/>
-          <w:color w:val="000000"/>
-        </w:rPr>
-        <w:t>Macro</w:t>
-      </w:r>
-      <w:r>
-        <w:rPr>
-          <w:rFonts w:eastAsia="Times New Roman"/>
-          <w:color w:val="000000"/>
-          <w:lang w:val="ru-RU"/>
-        </w:rPr>
-        <w:t>-</w:t>
-      </w:r>
-      <w:r>
-        <w:rPr>
-          <w:rFonts w:eastAsia="Times New Roman"/>
-          <w:color w:val="000000"/>
-        </w:rPr>
-        <w:t>F</w:t>
-      </w:r>
-      <w:r>
-        <w:rPr>
-          <w:rFonts w:eastAsia="Times New Roman"/>
-          <w:color w:val="000000"/>
-          <w:lang w:val="ru-RU"/>
-        </w:rPr>
-        <w:t xml:space="preserve">1 0,9109. На итоговом тесте она превысила </w:t>
-      </w:r>
-      <w:r>
-        <w:rPr>
-          <w:rFonts w:eastAsia="Times New Roman"/>
-          <w:color w:val="000000"/>
-        </w:rPr>
-        <w:t>baseline</w:t>
-      </w:r>
-      <w:r>
-        <w:rPr>
-          <w:rFonts w:eastAsia="Times New Roman"/>
-          <w:color w:val="000000"/>
-          <w:lang w:val="ru-RU"/>
-        </w:rPr>
-        <w:t xml:space="preserve"> по </w:t>
-      </w:r>
-      <w:r>
-        <w:rPr>
-          <w:rFonts w:eastAsia="Times New Roman"/>
-          <w:color w:val="000000"/>
-        </w:rPr>
-        <w:t>Macro</w:t>
-      </w:r>
-      <w:r>
-        <w:rPr>
-          <w:rFonts w:eastAsia="Times New Roman"/>
-          <w:color w:val="000000"/>
-          <w:lang w:val="ru-RU"/>
-        </w:rPr>
-        <w:t>-</w:t>
-      </w:r>
-      <w:r>
-        <w:rPr>
-          <w:rFonts w:eastAsia="Times New Roman"/>
-          <w:color w:val="000000"/>
-        </w:rPr>
-        <w:t>F</w:t>
-      </w:r>
-      <w:r>
-        <w:rPr>
-          <w:rFonts w:eastAsia="Times New Roman"/>
-          <w:color w:val="000000"/>
-          <w:lang w:val="ru-RU"/>
-        </w:rPr>
-        <w:t xml:space="preserve">1, а на отдельной проверке не превысила его по этой метрике. Возможность решать пилотную задачу подтверждена; стабильное превосходство над </w:t>
+        <w:t xml:space="preserve">отдельной проверке не превысила его по этой метрике. Возможность решать пилотную задачу подтверждена; стабильное превосходство над </w:t>
       </w:r>
       <w:r>
         <w:rPr>
@@ -7159,25 +6905,7 @@
           <w:color w:val="000000"/>
           <w:sz w:val="24"/>
         </w:rPr>
-        <w:t xml:space="preserve">[4] Charan </w:t>
-      </w:r>
-      <w:proofErr w:type="spellStart"/>
-      <w:r>
-        <w:rPr>
-          <w:rFonts w:eastAsia="Times New Roman"/>
-          <w:color w:val="000000"/>
-          <w:sz w:val="24"/>
-        </w:rPr>
-        <w:t>Puvvala</w:t>
-      </w:r>
-      <w:proofErr w:type="spellEnd"/>
-      <w:r>
-        <w:rPr>
-          <w:rFonts w:eastAsia="Times New Roman"/>
-          <w:color w:val="000000"/>
-          <w:sz w:val="24"/>
-        </w:rPr>
-        <w:t xml:space="preserve">. Company classification. Kaggle Datasets. Версия 1. </w:t>
+        <w:t xml:space="preserve">[4] Charan Puvvala. Company classification. Kaggle Datasets. Версия 1. </w:t>
       </w:r>
       <w:hyperlink r:id="rId9">
         <w:r>
@@ -7210,7 +6938,6 @@
         <w:t xml:space="preserve">[5] Репозиторий лабораторной работы. Ноутбук содержит код и сохранённые результаты в ячейках. </w:t>
       </w:r>
       <w:hyperlink r:id="rId10">
-        <w:proofErr w:type="spellStart"/>
         <w:r>
           <w:rPr>
             <w:rFonts w:eastAsia="Times New Roman"/>
@@ -7220,7 +6947,6 @@
           </w:rPr>
           <w:t>Источник</w:t>
         </w:r>
-        <w:proofErr w:type="spellEnd"/>
       </w:hyperlink>
     </w:p>
     <w:sectPr>

</xml_diff>